<commit_message>
Fetching Client in SPFX Client Tabel using Axios from the DB.
</commit_message>
<xml_diff>
--- a/Description_Coding_Parts/Part_n4_Client_Tab/Client_Tab_Docs.docx
+++ b/Description_Coding_Parts/Part_n4_Client_Tab/Client_Tab_Docs.docx
@@ -182,6 +182,13 @@
           <w:bCs/>
         </w:rPr>
         <w:t>)</w:t>
+      </w:r>
+      <w:r>
+        <w:rPr>
+          <w:b/>
+          <w:bCs/>
+        </w:rPr>
+        <w:tab/>
       </w:r>
     </w:p>
     <w:p>

</xml_diff>